<commit_message>
updated thesis report structure with custom LaTeX class and project documentation
</commit_message>
<xml_diff>
--- a/Thesis-Defense/defense/Load Demand Prediction Analysis Using ML/Feature Analysis and Model Interpretation for report writing.docx
+++ b/Thesis-Defense/defense/Load Demand Prediction Analysis Using ML/Feature Analysis and Model Interpretation for report writing.docx
@@ -4,8 +4,67 @@
   <w:body>
     <w:p>
       <w:r>
+        <w:t xml:space="preserve">Sequence : </w:t>
+      </w:r>
+    </w:p>
+    <w:p>
+      <w:r>
+        <w:t>1. Introduction to Feature Analysis</w:t>
+      </w:r>
+    </w:p>
+    <w:p>
+      <w:r>
+        <w:t>2. Feature Importance (</w:t>
+      </w:r>
+      <w:proofErr w:type="spellStart"/>
+      <w:r>
+        <w:t>XGBoost</w:t>
+      </w:r>
+      <w:proofErr w:type="spellEnd"/>
+      <w:r>
+        <w:t>)</w:t>
+      </w:r>
+    </w:p>
+    <w:p>
+      <w:r>
+        <w:t>3. Correlation Analysis</w:t>
+      </w:r>
+    </w:p>
+    <w:p>
+      <w:r>
+        <w:t>4</w:t>
+      </w:r>
+      <w:r>
+        <w:t>. Model Performance Justification</w:t>
+      </w:r>
+    </w:p>
+    <w:p>
+      <w:r>
+        <w:t xml:space="preserve">6. </w:t>
+      </w:r>
+      <w:r>
+        <w:t xml:space="preserve">How features contribute, how they relate, correlate, </w:t>
+      </w:r>
+      <w:r>
+        <w:t>Why Some Features Are Not Important</w:t>
+      </w:r>
+      <w:r>
+        <w:t xml:space="preserve"> or inversely related ? </w:t>
+      </w:r>
+    </w:p>
+    <w:p>
+      <w:r>
+        <w:t>7. Final Conclusion</w:t>
+      </w:r>
+      <w:r>
+        <w:t>, discussion</w:t>
+      </w:r>
+    </w:p>
+    <w:p/>
+    <w:p>
+      <w:r>
         <w:pict w14:anchorId="08EB0DCB">
-          <v:rect id="_x0000_i1253" style="width:0;height:1.5pt" o:hralign="center" o:hrstd="t" o:hr="t" fillcolor="#a0a0a0" stroked="f"/>
+          <v:rect id="_x0000_i1025" style="width:0;height:1.5pt" o:hralign="center" o:hrstd="t" o:hr="t" fillcolor="#a0a0a0" stroked="f"/>
         </w:pict>
       </w:r>
     </w:p>
@@ -35,7 +94,7 @@
     <w:p>
       <w:r>
         <w:pict w14:anchorId="3C7CD586">
-          <v:rect id="_x0000_i1254" style="width:0;height:1.5pt" o:hralign="center" o:hrstd="t" o:hr="t" fillcolor="#a0a0a0" stroked="f"/>
+          <v:rect id="_x0000_i1026" style="width:0;height:1.5pt" o:hralign="center" o:hrstd="t" o:hr="t" fillcolor="#a0a0a0" stroked="f"/>
         </w:pict>
       </w:r>
     </w:p>
@@ -90,7 +149,7 @@
     <w:p>
       <w:r>
         <w:pict w14:anchorId="1C18590A">
-          <v:rect id="_x0000_i1255" style="width:0;height:1.5pt" o:hralign="center" o:hrstd="t" o:hr="t" fillcolor="#a0a0a0" stroked="f"/>
+          <v:rect id="_x0000_i1027" style="width:0;height:1.5pt" o:hralign="center" o:hrstd="t" o:hr="t" fillcolor="#a0a0a0" stroked="f"/>
         </w:pict>
       </w:r>
     </w:p>
@@ -170,7 +229,7 @@
     <w:p>
       <w:r>
         <w:pict w14:anchorId="6D1C8290">
-          <v:rect id="_x0000_i1256" style="width:0;height:1.5pt" o:hralign="center" o:hrstd="t" o:hr="t" fillcolor="#a0a0a0" stroked="f"/>
+          <v:rect id="_x0000_i1028" style="width:0;height:1.5pt" o:hralign="center" o:hrstd="t" o:hr="t" fillcolor="#a0a0a0" stroked="f"/>
         </w:pict>
       </w:r>
     </w:p>
@@ -236,6 +295,7 @@
         </w:numPr>
       </w:pPr>
       <w:r>
+        <w:lastRenderedPageBreak/>
         <w:t xml:space="preserve">(after removal) </w:t>
       </w:r>
       <w:proofErr w:type="spellStart"/>
@@ -250,7 +310,7 @@
     <w:p>
       <w:r>
         <w:pict w14:anchorId="79C9B569">
-          <v:rect id="_x0000_i1257" style="width:0;height:1.5pt" o:hralign="center" o:hrstd="t" o:hr="t" fillcolor="#a0a0a0" stroked="f"/>
+          <v:rect id="_x0000_i1029" style="width:0;height:1.5pt" o:hralign="center" o:hrstd="t" o:hr="t" fillcolor="#a0a0a0" stroked="f"/>
         </w:pict>
       </w:r>
     </w:p>
@@ -285,7 +345,7 @@
     <w:p>
       <w:r>
         <w:pict w14:anchorId="4A417AF3">
-          <v:rect id="_x0000_i1258" style="width:0;height:1.5pt" o:hralign="center" o:hrstd="t" o:hr="t" fillcolor="#a0a0a0" stroked="f"/>
+          <v:rect id="_x0000_i1030" style="width:0;height:1.5pt" o:hralign="center" o:hrstd="t" o:hr="t" fillcolor="#a0a0a0" stroked="f"/>
         </w:pict>
       </w:r>
     </w:p>
@@ -329,9 +389,8 @@
     </w:p>
     <w:p>
       <w:r>
-        <w:lastRenderedPageBreak/>
         <w:pict w14:anchorId="4D169537">
-          <v:rect id="_x0000_i1259" style="width:0;height:1.5pt" o:hralign="center" o:hrstd="t" o:hr="t" fillcolor="#a0a0a0" stroked="f"/>
+          <v:rect id="_x0000_i1031" style="width:0;height:1.5pt" o:hralign="center" o:hrstd="t" o:hr="t" fillcolor="#a0a0a0" stroked="f"/>
         </w:pict>
       </w:r>
     </w:p>
@@ -399,7 +458,7 @@
     <w:p>
       <w:r>
         <w:pict w14:anchorId="7667501F">
-          <v:rect id="_x0000_i1260" style="width:0;height:1.5pt" o:hralign="center" o:hrstd="t" o:hr="t" fillcolor="#a0a0a0" stroked="f"/>
+          <v:rect id="_x0000_i1032" style="width:0;height:1.5pt" o:hralign="center" o:hrstd="t" o:hr="t" fillcolor="#a0a0a0" stroked="f"/>
         </w:pict>
       </w:r>
     </w:p>
@@ -434,23 +493,164 @@
     <w:p>
       <w:r>
         <w:pict w14:anchorId="747999BD">
-          <v:rect id="_x0000_i1261" style="width:0;height:1.5pt" o:hralign="center" o:hrstd="t" o:hr="t" fillcolor="#a0a0a0" stroked="f"/>
+          <v:rect id="_x0000_i1033" style="width:0;height:1.5pt" o:hralign="center" o:hrstd="t" o:hr="t" fillcolor="#a0a0a0" stroked="f"/>
         </w:pict>
       </w:r>
     </w:p>
     <w:p>
       <w:pPr>
         <w:rPr>
-          <w:b/>
-          <w:bCs/>
-        </w:rPr>
-      </w:pPr>
-      <w:r>
-        <w:rPr>
           <w:rFonts w:ascii="Segoe UI Emoji" w:hAnsi="Segoe UI Emoji" w:cs="Segoe UI Emoji"/>
           <w:b/>
           <w:bCs/>
         </w:rPr>
+      </w:pPr>
+      <w:r>
+        <w:rPr>
+          <w:rFonts w:ascii="Segoe UI Emoji" w:hAnsi="Segoe UI Emoji" w:cs="Segoe UI Emoji"/>
+          <w:b/>
+          <w:bCs/>
+          <w:noProof/>
+        </w:rPr>
+        <w:lastRenderedPageBreak/>
+        <w:drawing>
+          <wp:inline distT="0" distB="0" distL="0" distR="0" wp14:anchorId="09E0580C" wp14:editId="17BD45F9">
+            <wp:extent cx="5943600" cy="4743450"/>
+            <wp:effectExtent l="0" t="0" r="0" b="0"/>
+            <wp:docPr id="1" name="Picture 1"/>
+            <wp:cNvGraphicFramePr>
+              <a:graphicFrameLocks xmlns:a="http://schemas.openxmlformats.org/drawingml/2006/main" noChangeAspect="1"/>
+            </wp:cNvGraphicFramePr>
+            <a:graphic xmlns:a="http://schemas.openxmlformats.org/drawingml/2006/main">
+              <a:graphicData uri="http://schemas.openxmlformats.org/drawingml/2006/picture">
+                <pic:pic xmlns:pic="http://schemas.openxmlformats.org/drawingml/2006/picture">
+                  <pic:nvPicPr>
+                    <pic:cNvPr id="0" name="Picture 25"/>
+                    <pic:cNvPicPr>
+                      <a:picLocks noChangeAspect="1" noChangeArrowheads="1"/>
+                    </pic:cNvPicPr>
+                  </pic:nvPicPr>
+                  <pic:blipFill>
+                    <a:blip r:embed="rId5">
+                      <a:extLst>
+                        <a:ext uri="{28A0092B-C50C-407E-A947-70E740481C1C}">
+                          <a14:useLocalDpi xmlns:a14="http://schemas.microsoft.com/office/drawing/2010/main" val="0"/>
+                        </a:ext>
+                      </a:extLst>
+                    </a:blip>
+                    <a:srcRect/>
+                    <a:stretch>
+                      <a:fillRect/>
+                    </a:stretch>
+                  </pic:blipFill>
+                  <pic:spPr bwMode="auto">
+                    <a:xfrm>
+                      <a:off x="0" y="0"/>
+                      <a:ext cx="5943600" cy="4743450"/>
+                    </a:xfrm>
+                    <a:prstGeom prst="rect">
+                      <a:avLst/>
+                    </a:prstGeom>
+                    <a:noFill/>
+                    <a:ln>
+                      <a:noFill/>
+                    </a:ln>
+                  </pic:spPr>
+                </pic:pic>
+              </a:graphicData>
+            </a:graphic>
+          </wp:inline>
+        </w:drawing>
+      </w:r>
+    </w:p>
+    <w:p>
+      <w:pPr>
+        <w:rPr>
+          <w:rFonts w:ascii="Segoe UI Emoji" w:hAnsi="Segoe UI Emoji" w:cs="Segoe UI Emoji"/>
+          <w:b/>
+          <w:bCs/>
+        </w:rPr>
+      </w:pPr>
+    </w:p>
+    <w:p>
+      <w:pPr>
+        <w:rPr>
+          <w:rFonts w:ascii="Segoe UI Emoji" w:hAnsi="Segoe UI Emoji" w:cs="Segoe UI Emoji"/>
+          <w:b/>
+          <w:bCs/>
+        </w:rPr>
+      </w:pPr>
+      <w:r>
+        <w:rPr>
+          <w:rFonts w:ascii="Segoe UI Emoji" w:hAnsi="Segoe UI Emoji" w:cs="Segoe UI Emoji"/>
+          <w:b/>
+          <w:bCs/>
+          <w:noProof/>
+        </w:rPr>
+        <w:lastRenderedPageBreak/>
+        <w:drawing>
+          <wp:inline distT="0" distB="0" distL="0" distR="0" wp14:anchorId="0E13DEFE" wp14:editId="5EB7FEA1">
+            <wp:extent cx="5934075" cy="4743450"/>
+            <wp:effectExtent l="0" t="0" r="9525" b="0"/>
+            <wp:docPr id="2" name="Picture 2"/>
+            <wp:cNvGraphicFramePr>
+              <a:graphicFrameLocks xmlns:a="http://schemas.openxmlformats.org/drawingml/2006/main" noChangeAspect="1"/>
+            </wp:cNvGraphicFramePr>
+            <a:graphic xmlns:a="http://schemas.openxmlformats.org/drawingml/2006/main">
+              <a:graphicData uri="http://schemas.openxmlformats.org/drawingml/2006/picture">
+                <pic:pic xmlns:pic="http://schemas.openxmlformats.org/drawingml/2006/picture">
+                  <pic:nvPicPr>
+                    <pic:cNvPr id="0" name="Picture 26"/>
+                    <pic:cNvPicPr>
+                      <a:picLocks noChangeAspect="1" noChangeArrowheads="1"/>
+                    </pic:cNvPicPr>
+                  </pic:nvPicPr>
+                  <pic:blipFill>
+                    <a:blip r:embed="rId6">
+                      <a:extLst>
+                        <a:ext uri="{28A0092B-C50C-407E-A947-70E740481C1C}">
+                          <a14:useLocalDpi xmlns:a14="http://schemas.microsoft.com/office/drawing/2010/main" val="0"/>
+                        </a:ext>
+                      </a:extLst>
+                    </a:blip>
+                    <a:srcRect/>
+                    <a:stretch>
+                      <a:fillRect/>
+                    </a:stretch>
+                  </pic:blipFill>
+                  <pic:spPr bwMode="auto">
+                    <a:xfrm>
+                      <a:off x="0" y="0"/>
+                      <a:ext cx="5934075" cy="4743450"/>
+                    </a:xfrm>
+                    <a:prstGeom prst="rect">
+                      <a:avLst/>
+                    </a:prstGeom>
+                    <a:noFill/>
+                    <a:ln>
+                      <a:noFill/>
+                    </a:ln>
+                  </pic:spPr>
+                </pic:pic>
+              </a:graphicData>
+            </a:graphic>
+          </wp:inline>
+        </w:drawing>
+      </w:r>
+    </w:p>
+    <w:p>
+      <w:pPr>
+        <w:rPr>
+          <w:b/>
+          <w:bCs/>
+        </w:rPr>
+      </w:pPr>
+      <w:r>
+        <w:rPr>
+          <w:rFonts w:ascii="Segoe UI Emoji" w:hAnsi="Segoe UI Emoji" w:cs="Segoe UI Emoji"/>
+          <w:b/>
+          <w:bCs/>
+        </w:rPr>
         <w:t>🔷</w:t>
       </w:r>
       <w:r>
@@ -506,7 +706,7 @@
     <w:p>
       <w:r>
         <w:pict w14:anchorId="780BD7D3">
-          <v:rect id="_x0000_i1262" style="width:0;height:1.5pt" o:hralign="center" o:hrstd="t" o:hr="t" fillcolor="#a0a0a0" stroked="f"/>
+          <v:rect id="_x0000_i1034" style="width:0;height:1.5pt" o:hralign="center" o:hrstd="t" o:hr="t" fillcolor="#a0a0a0" stroked="f"/>
         </w:pict>
       </w:r>
     </w:p>
@@ -572,7 +772,7 @@
     <w:p>
       <w:r>
         <w:pict w14:anchorId="7963B6B4">
-          <v:rect id="_x0000_i1263" style="width:0;height:1.5pt" o:hralign="center" o:hrstd="t" o:hr="t" fillcolor="#a0a0a0" stroked="f"/>
+          <v:rect id="_x0000_i1035" style="width:0;height:1.5pt" o:hralign="center" o:hrstd="t" o:hr="t" fillcolor="#a0a0a0" stroked="f"/>
         </w:pict>
       </w:r>
     </w:p>
@@ -589,6 +789,7 @@
           <w:b/>
           <w:bCs/>
         </w:rPr>
+        <w:lastRenderedPageBreak/>
         <w:t>🧠</w:t>
       </w:r>
       <w:r>
@@ -617,7 +818,7 @@
     <w:p>
       <w:r>
         <w:pict w14:anchorId="01651DBE">
-          <v:rect id="_x0000_i1264" style="width:0;height:1.5pt" o:hralign="center" o:hrstd="t" o:hr="t" fillcolor="#a0a0a0" stroked="f"/>
+          <v:rect id="_x0000_i1036" style="width:0;height:1.5pt" o:hralign="center" o:hrstd="t" o:hr="t" fillcolor="#a0a0a0" stroked="f"/>
         </w:pict>
       </w:r>
     </w:p>
@@ -646,30 +847,1223 @@
     </w:p>
     <w:p>
       <w:r>
+        <w:t>“Correlation analysis validates the dominance of system-level features observed in feature importance results.”</w:t>
+      </w:r>
+    </w:p>
+    <w:p>
+      <w:r>
+        <w:pict w14:anchorId="1F32A95D">
+          <v:rect id="_x0000_i1037" style="width:0;height:1.5pt" o:hralign="center" o:hrstd="t" o:hr="t" fillcolor="#a0a0a0" stroked="f"/>
+        </w:pict>
+      </w:r>
+    </w:p>
+    <w:p>
+      <w:pPr>
+        <w:rPr>
+          <w:rFonts w:ascii="Segoe UI Emoji" w:hAnsi="Segoe UI Emoji" w:cs="Segoe UI Emoji"/>
+          <w:b/>
+          <w:bCs/>
+        </w:rPr>
+      </w:pPr>
+      <w:r>
+        <w:rPr>
+          <w:rFonts w:ascii="Segoe UI Emoji" w:hAnsi="Segoe UI Emoji" w:cs="Segoe UI Emoji"/>
+          <w:b/>
+          <w:bCs/>
+          <w:noProof/>
+        </w:rPr>
+        <w:drawing>
+          <wp:inline distT="0" distB="0" distL="0" distR="0" wp14:anchorId="01DFA4E0" wp14:editId="7F0B8D55">
+            <wp:extent cx="5943600" cy="4743450"/>
+            <wp:effectExtent l="0" t="0" r="0" b="0"/>
+            <wp:docPr id="3" name="Picture 3"/>
+            <wp:cNvGraphicFramePr>
+              <a:graphicFrameLocks xmlns:a="http://schemas.openxmlformats.org/drawingml/2006/main" noChangeAspect="1"/>
+            </wp:cNvGraphicFramePr>
+            <a:graphic xmlns:a="http://schemas.openxmlformats.org/drawingml/2006/main">
+              <a:graphicData uri="http://schemas.openxmlformats.org/drawingml/2006/picture">
+                <pic:pic xmlns:pic="http://schemas.openxmlformats.org/drawingml/2006/picture">
+                  <pic:nvPicPr>
+                    <pic:cNvPr id="0" name="Picture 27"/>
+                    <pic:cNvPicPr>
+                      <a:picLocks noChangeAspect="1" noChangeArrowheads="1"/>
+                    </pic:cNvPicPr>
+                  </pic:nvPicPr>
+                  <pic:blipFill>
+                    <a:blip r:embed="rId7">
+                      <a:extLst>
+                        <a:ext uri="{28A0092B-C50C-407E-A947-70E740481C1C}">
+                          <a14:useLocalDpi xmlns:a14="http://schemas.microsoft.com/office/drawing/2010/main" val="0"/>
+                        </a:ext>
+                      </a:extLst>
+                    </a:blip>
+                    <a:srcRect/>
+                    <a:stretch>
+                      <a:fillRect/>
+                    </a:stretch>
+                  </pic:blipFill>
+                  <pic:spPr bwMode="auto">
+                    <a:xfrm>
+                      <a:off x="0" y="0"/>
+                      <a:ext cx="5943600" cy="4743450"/>
+                    </a:xfrm>
+                    <a:prstGeom prst="rect">
+                      <a:avLst/>
+                    </a:prstGeom>
+                    <a:noFill/>
+                    <a:ln>
+                      <a:noFill/>
+                    </a:ln>
+                  </pic:spPr>
+                </pic:pic>
+              </a:graphicData>
+            </a:graphic>
+          </wp:inline>
+        </w:drawing>
+      </w:r>
+    </w:p>
+    <w:p>
+      <w:pPr>
+        <w:rPr>
+          <w:rFonts w:ascii="Segoe UI Emoji" w:hAnsi="Segoe UI Emoji" w:cs="Segoe UI Emoji"/>
+          <w:b/>
+          <w:bCs/>
+        </w:rPr>
+      </w:pPr>
+    </w:p>
+    <w:p>
+      <w:pPr>
+        <w:rPr>
+          <w:rFonts w:ascii="Segoe UI Emoji" w:hAnsi="Segoe UI Emoji" w:cs="Segoe UI Emoji"/>
+          <w:b/>
+          <w:bCs/>
+        </w:rPr>
+      </w:pPr>
+    </w:p>
+    <w:p>
+      <w:pPr>
+        <w:rPr>
+          <w:rFonts w:ascii="Segoe UI Emoji" w:hAnsi="Segoe UI Emoji" w:cs="Segoe UI Emoji"/>
+          <w:b/>
+          <w:bCs/>
+        </w:rPr>
+      </w:pPr>
+      <w:r>
+        <w:rPr>
+          <w:rFonts w:ascii="Segoe UI Emoji" w:hAnsi="Segoe UI Emoji" w:cs="Segoe UI Emoji"/>
+          <w:b/>
+          <w:bCs/>
+          <w:noProof/>
+        </w:rPr>
         <w:lastRenderedPageBreak/>
-        <w:t>“Correlation analysis validates the dominance of system-level features observed in feature importance results.”</w:t>
-      </w:r>
-    </w:p>
-    <w:p>
-      <w:r>
-        <w:pict w14:anchorId="1F32A95D">
-          <v:rect id="_x0000_i1265" style="width:0;height:1.5pt" o:hralign="center" o:hrstd="t" o:hr="t" fillcolor="#a0a0a0" stroked="f"/>
-        </w:pict>
-      </w:r>
-    </w:p>
-    <w:p>
-      <w:pPr>
-        <w:rPr>
-          <w:b/>
-          <w:bCs/>
-        </w:rPr>
-      </w:pPr>
-      <w:r>
+        <w:drawing>
+          <wp:inline distT="0" distB="0" distL="0" distR="0" wp14:anchorId="387C6FB8" wp14:editId="0F577BB8">
+            <wp:extent cx="5934075" cy="5486400"/>
+            <wp:effectExtent l="0" t="0" r="9525" b="0"/>
+            <wp:docPr id="4" name="Picture 4"/>
+            <wp:cNvGraphicFramePr>
+              <a:graphicFrameLocks xmlns:a="http://schemas.openxmlformats.org/drawingml/2006/main" noChangeAspect="1"/>
+            </wp:cNvGraphicFramePr>
+            <a:graphic xmlns:a="http://schemas.openxmlformats.org/drawingml/2006/main">
+              <a:graphicData uri="http://schemas.openxmlformats.org/drawingml/2006/picture">
+                <pic:pic xmlns:pic="http://schemas.openxmlformats.org/drawingml/2006/picture">
+                  <pic:nvPicPr>
+                    <pic:cNvPr id="0" name="Picture 28"/>
+                    <pic:cNvPicPr>
+                      <a:picLocks noChangeAspect="1" noChangeArrowheads="1"/>
+                    </pic:cNvPicPr>
+                  </pic:nvPicPr>
+                  <pic:blipFill>
+                    <a:blip r:embed="rId8">
+                      <a:extLst>
+                        <a:ext uri="{28A0092B-C50C-407E-A947-70E740481C1C}">
+                          <a14:useLocalDpi xmlns:a14="http://schemas.microsoft.com/office/drawing/2010/main" val="0"/>
+                        </a:ext>
+                      </a:extLst>
+                    </a:blip>
+                    <a:srcRect/>
+                    <a:stretch>
+                      <a:fillRect/>
+                    </a:stretch>
+                  </pic:blipFill>
+                  <pic:spPr bwMode="auto">
+                    <a:xfrm>
+                      <a:off x="0" y="0"/>
+                      <a:ext cx="5934075" cy="5486400"/>
+                    </a:xfrm>
+                    <a:prstGeom prst="rect">
+                      <a:avLst/>
+                    </a:prstGeom>
+                    <a:noFill/>
+                    <a:ln>
+                      <a:noFill/>
+                    </a:ln>
+                  </pic:spPr>
+                </pic:pic>
+              </a:graphicData>
+            </a:graphic>
+          </wp:inline>
+        </w:drawing>
+      </w:r>
+    </w:p>
+    <w:tbl>
+      <w:tblPr>
+        <w:tblW w:w="5660" w:type="dxa"/>
+        <w:tblInd w:w="108" w:type="dxa"/>
+        <w:tblLook w:val="04A0" w:firstRow="1" w:lastRow="0" w:firstColumn="1" w:lastColumn="0" w:noHBand="0" w:noVBand="1"/>
+      </w:tblPr>
+      <w:tblGrid>
+        <w:gridCol w:w="1760"/>
+        <w:gridCol w:w="980"/>
+        <w:gridCol w:w="1080"/>
+        <w:gridCol w:w="880"/>
+        <w:gridCol w:w="960"/>
+      </w:tblGrid>
+      <w:tr>
+        <w:trPr>
+          <w:trHeight w:val="300"/>
+        </w:trPr>
+        <w:tc>
+          <w:tcPr>
+            <w:tcW w:w="1760" w:type="dxa"/>
+            <w:tcBorders>
+              <w:top w:val="nil"/>
+              <w:left w:val="nil"/>
+              <w:bottom w:val="nil"/>
+              <w:right w:val="nil"/>
+            </w:tcBorders>
+            <w:shd w:val="clear" w:color="auto" w:fill="auto"/>
+            <w:noWrap/>
+            <w:vAlign w:val="bottom"/>
+            <w:hideMark/>
+          </w:tcPr>
+          <w:p>
+            <w:pPr>
+              <w:spacing w:after="0" w:line="240" w:lineRule="auto"/>
+              <w:rPr>
+                <w:rFonts w:ascii="Aptos Narrow" w:eastAsia="Times New Roman" w:hAnsi="Aptos Narrow" w:cs="Times New Roman"/>
+                <w:color w:val="000000"/>
+                <w:kern w:val="0"/>
+                <w14:ligatures w14:val="none"/>
+              </w:rPr>
+            </w:pPr>
+            <w:r>
+              <w:rPr>
+                <w:rFonts w:ascii="Aptos Narrow" w:eastAsia="Times New Roman" w:hAnsi="Aptos Narrow" w:cs="Times New Roman"/>
+                <w:color w:val="000000"/>
+                <w:kern w:val="0"/>
+                <w14:ligatures w14:val="none"/>
+              </w:rPr>
+              <w:t>Model</w:t>
+            </w:r>
+          </w:p>
+        </w:tc>
+        <w:tc>
+          <w:tcPr>
+            <w:tcW w:w="980" w:type="dxa"/>
+            <w:tcBorders>
+              <w:top w:val="nil"/>
+              <w:left w:val="nil"/>
+              <w:bottom w:val="nil"/>
+              <w:right w:val="nil"/>
+            </w:tcBorders>
+            <w:shd w:val="clear" w:color="auto" w:fill="auto"/>
+            <w:noWrap/>
+            <w:vAlign w:val="bottom"/>
+            <w:hideMark/>
+          </w:tcPr>
+          <w:p>
+            <w:pPr>
+              <w:spacing w:after="0" w:line="240" w:lineRule="auto"/>
+              <w:rPr>
+                <w:rFonts w:ascii="Aptos Narrow" w:eastAsia="Times New Roman" w:hAnsi="Aptos Narrow" w:cs="Times New Roman"/>
+                <w:color w:val="000000"/>
+                <w:kern w:val="0"/>
+                <w14:ligatures w14:val="none"/>
+              </w:rPr>
+            </w:pPr>
+            <w:r>
+              <w:rPr>
+                <w:rFonts w:ascii="Aptos Narrow" w:eastAsia="Times New Roman" w:hAnsi="Aptos Narrow" w:cs="Times New Roman"/>
+                <w:color w:val="000000"/>
+                <w:kern w:val="0"/>
+                <w14:ligatures w14:val="none"/>
+              </w:rPr>
+              <w:t>MAE (kW)</w:t>
+            </w:r>
+          </w:p>
+        </w:tc>
+        <w:tc>
+          <w:tcPr>
+            <w:tcW w:w="1080" w:type="dxa"/>
+            <w:tcBorders>
+              <w:top w:val="nil"/>
+              <w:left w:val="nil"/>
+              <w:bottom w:val="nil"/>
+              <w:right w:val="nil"/>
+            </w:tcBorders>
+            <w:shd w:val="clear" w:color="auto" w:fill="auto"/>
+            <w:noWrap/>
+            <w:vAlign w:val="bottom"/>
+            <w:hideMark/>
+          </w:tcPr>
+          <w:p>
+            <w:pPr>
+              <w:spacing w:after="0" w:line="240" w:lineRule="auto"/>
+              <w:rPr>
+                <w:rFonts w:ascii="Aptos Narrow" w:eastAsia="Times New Roman" w:hAnsi="Aptos Narrow" w:cs="Times New Roman"/>
+                <w:color w:val="000000"/>
+                <w:kern w:val="0"/>
+                <w14:ligatures w14:val="none"/>
+              </w:rPr>
+            </w:pPr>
+            <w:r>
+              <w:rPr>
+                <w:rFonts w:ascii="Aptos Narrow" w:eastAsia="Times New Roman" w:hAnsi="Aptos Narrow" w:cs="Times New Roman"/>
+                <w:color w:val="000000"/>
+                <w:kern w:val="0"/>
+                <w14:ligatures w14:val="none"/>
+              </w:rPr>
+              <w:t>RMSE (kW)</w:t>
+            </w:r>
+          </w:p>
+        </w:tc>
+        <w:tc>
+          <w:tcPr>
+            <w:tcW w:w="880" w:type="dxa"/>
+            <w:tcBorders>
+              <w:top w:val="nil"/>
+              <w:left w:val="nil"/>
+              <w:bottom w:val="nil"/>
+              <w:right w:val="nil"/>
+            </w:tcBorders>
+            <w:shd w:val="clear" w:color="auto" w:fill="auto"/>
+            <w:noWrap/>
+            <w:vAlign w:val="bottom"/>
+            <w:hideMark/>
+          </w:tcPr>
+          <w:p>
+            <w:pPr>
+              <w:spacing w:after="0" w:line="240" w:lineRule="auto"/>
+              <w:rPr>
+                <w:rFonts w:ascii="Aptos Narrow" w:eastAsia="Times New Roman" w:hAnsi="Aptos Narrow" w:cs="Times New Roman"/>
+                <w:color w:val="000000"/>
+                <w:kern w:val="0"/>
+                <w14:ligatures w14:val="none"/>
+              </w:rPr>
+            </w:pPr>
+            <w:r>
+              <w:rPr>
+                <w:rFonts w:ascii="Aptos Narrow" w:eastAsia="Times New Roman" w:hAnsi="Aptos Narrow" w:cs="Times New Roman"/>
+                <w:color w:val="000000"/>
+                <w:kern w:val="0"/>
+                <w14:ligatures w14:val="none"/>
+              </w:rPr>
+              <w:t>R2 Score</w:t>
+            </w:r>
+          </w:p>
+        </w:tc>
+        <w:tc>
+          <w:tcPr>
+            <w:tcW w:w="960" w:type="dxa"/>
+            <w:tcBorders>
+              <w:top w:val="nil"/>
+              <w:left w:val="nil"/>
+              <w:bottom w:val="nil"/>
+              <w:right w:val="nil"/>
+            </w:tcBorders>
+            <w:shd w:val="clear" w:color="auto" w:fill="auto"/>
+            <w:noWrap/>
+            <w:vAlign w:val="bottom"/>
+            <w:hideMark/>
+          </w:tcPr>
+          <w:p>
+            <w:pPr>
+              <w:spacing w:after="0" w:line="240" w:lineRule="auto"/>
+              <w:rPr>
+                <w:rFonts w:ascii="Aptos Narrow" w:eastAsia="Times New Roman" w:hAnsi="Aptos Narrow" w:cs="Times New Roman"/>
+                <w:color w:val="000000"/>
+                <w:kern w:val="0"/>
+                <w14:ligatures w14:val="none"/>
+              </w:rPr>
+            </w:pPr>
+          </w:p>
+        </w:tc>
+      </w:tr>
+      <w:tr>
+        <w:trPr>
+          <w:trHeight w:val="300"/>
+        </w:trPr>
+        <w:tc>
+          <w:tcPr>
+            <w:tcW w:w="1760" w:type="dxa"/>
+            <w:tcBorders>
+              <w:top w:val="nil"/>
+              <w:left w:val="nil"/>
+              <w:bottom w:val="nil"/>
+              <w:right w:val="nil"/>
+            </w:tcBorders>
+            <w:shd w:val="clear" w:color="auto" w:fill="auto"/>
+            <w:noWrap/>
+            <w:vAlign w:val="bottom"/>
+            <w:hideMark/>
+          </w:tcPr>
+          <w:p>
+            <w:pPr>
+              <w:spacing w:after="0" w:line="240" w:lineRule="auto"/>
+              <w:rPr>
+                <w:rFonts w:ascii="Aptos Narrow" w:eastAsia="Times New Roman" w:hAnsi="Aptos Narrow" w:cs="Times New Roman"/>
+                <w:color w:val="000000"/>
+                <w:kern w:val="0"/>
+                <w14:ligatures w14:val="none"/>
+              </w:rPr>
+            </w:pPr>
+            <w:r>
+              <w:rPr>
+                <w:rFonts w:ascii="Aptos Narrow" w:eastAsia="Times New Roman" w:hAnsi="Aptos Narrow" w:cs="Times New Roman"/>
+                <w:color w:val="000000"/>
+                <w:kern w:val="0"/>
+                <w14:ligatures w14:val="none"/>
+              </w:rPr>
+              <w:t>Linear Regression</w:t>
+            </w:r>
+          </w:p>
+        </w:tc>
+        <w:tc>
+          <w:tcPr>
+            <w:tcW w:w="980" w:type="dxa"/>
+            <w:tcBorders>
+              <w:top w:val="nil"/>
+              <w:left w:val="nil"/>
+              <w:bottom w:val="nil"/>
+              <w:right w:val="nil"/>
+            </w:tcBorders>
+            <w:shd w:val="clear" w:color="auto" w:fill="auto"/>
+            <w:noWrap/>
+            <w:vAlign w:val="bottom"/>
+            <w:hideMark/>
+          </w:tcPr>
+          <w:p>
+            <w:pPr>
+              <w:spacing w:after="0" w:line="240" w:lineRule="auto"/>
+              <w:jc w:val="right"/>
+              <w:rPr>
+                <w:rFonts w:ascii="Aptos Narrow" w:eastAsia="Times New Roman" w:hAnsi="Aptos Narrow" w:cs="Times New Roman"/>
+                <w:color w:val="000000"/>
+                <w:kern w:val="0"/>
+                <w14:ligatures w14:val="none"/>
+              </w:rPr>
+            </w:pPr>
+            <w:r>
+              <w:rPr>
+                <w:rFonts w:ascii="Aptos Narrow" w:eastAsia="Times New Roman" w:hAnsi="Aptos Narrow" w:cs="Times New Roman"/>
+                <w:color w:val="000000"/>
+                <w:kern w:val="0"/>
+                <w14:ligatures w14:val="none"/>
+              </w:rPr>
+              <w:t>8.5746</w:t>
+            </w:r>
+          </w:p>
+        </w:tc>
+        <w:tc>
+          <w:tcPr>
+            <w:tcW w:w="1080" w:type="dxa"/>
+            <w:tcBorders>
+              <w:top w:val="nil"/>
+              <w:left w:val="nil"/>
+              <w:bottom w:val="nil"/>
+              <w:right w:val="nil"/>
+            </w:tcBorders>
+            <w:shd w:val="clear" w:color="auto" w:fill="auto"/>
+            <w:noWrap/>
+            <w:vAlign w:val="bottom"/>
+            <w:hideMark/>
+          </w:tcPr>
+          <w:p>
+            <w:pPr>
+              <w:spacing w:after="0" w:line="240" w:lineRule="auto"/>
+              <w:jc w:val="right"/>
+              <w:rPr>
+                <w:rFonts w:ascii="Aptos Narrow" w:eastAsia="Times New Roman" w:hAnsi="Aptos Narrow" w:cs="Times New Roman"/>
+                <w:color w:val="000000"/>
+                <w:kern w:val="0"/>
+                <w14:ligatures w14:val="none"/>
+              </w:rPr>
+            </w:pPr>
+            <w:r>
+              <w:rPr>
+                <w:rFonts w:ascii="Aptos Narrow" w:eastAsia="Times New Roman" w:hAnsi="Aptos Narrow" w:cs="Times New Roman"/>
+                <w:color w:val="000000"/>
+                <w:kern w:val="0"/>
+                <w14:ligatures w14:val="none"/>
+              </w:rPr>
+              <w:t>11.2403</w:t>
+            </w:r>
+          </w:p>
+        </w:tc>
+        <w:tc>
+          <w:tcPr>
+            <w:tcW w:w="880" w:type="dxa"/>
+            <w:tcBorders>
+              <w:top w:val="nil"/>
+              <w:left w:val="nil"/>
+              <w:bottom w:val="nil"/>
+              <w:right w:val="nil"/>
+            </w:tcBorders>
+            <w:shd w:val="clear" w:color="auto" w:fill="auto"/>
+            <w:noWrap/>
+            <w:vAlign w:val="bottom"/>
+            <w:hideMark/>
+          </w:tcPr>
+          <w:p>
+            <w:pPr>
+              <w:spacing w:after="0" w:line="240" w:lineRule="auto"/>
+              <w:jc w:val="right"/>
+              <w:rPr>
+                <w:rFonts w:ascii="Aptos Narrow" w:eastAsia="Times New Roman" w:hAnsi="Aptos Narrow" w:cs="Times New Roman"/>
+                <w:color w:val="000000"/>
+                <w:kern w:val="0"/>
+                <w14:ligatures w14:val="none"/>
+              </w:rPr>
+            </w:pPr>
+            <w:r>
+              <w:rPr>
+                <w:rFonts w:ascii="Aptos Narrow" w:eastAsia="Times New Roman" w:hAnsi="Aptos Narrow" w:cs="Times New Roman"/>
+                <w:color w:val="000000"/>
+                <w:kern w:val="0"/>
+                <w14:ligatures w14:val="none"/>
+              </w:rPr>
+              <w:t>0.9991</w:t>
+            </w:r>
+          </w:p>
+        </w:tc>
+        <w:tc>
+          <w:tcPr>
+            <w:tcW w:w="960" w:type="dxa"/>
+            <w:tcBorders>
+              <w:top w:val="nil"/>
+              <w:left w:val="nil"/>
+              <w:bottom w:val="nil"/>
+              <w:right w:val="nil"/>
+            </w:tcBorders>
+            <w:shd w:val="clear" w:color="auto" w:fill="auto"/>
+            <w:noWrap/>
+            <w:vAlign w:val="bottom"/>
+            <w:hideMark/>
+          </w:tcPr>
+          <w:p>
+            <w:pPr>
+              <w:spacing w:after="0" w:line="240" w:lineRule="auto"/>
+              <w:jc w:val="right"/>
+              <w:rPr>
+                <w:rFonts w:ascii="Aptos Narrow" w:eastAsia="Times New Roman" w:hAnsi="Aptos Narrow" w:cs="Times New Roman"/>
+                <w:color w:val="000000"/>
+                <w:kern w:val="0"/>
+                <w14:ligatures w14:val="none"/>
+              </w:rPr>
+            </w:pPr>
+          </w:p>
+        </w:tc>
+      </w:tr>
+      <w:tr>
+        <w:trPr>
+          <w:trHeight w:val="300"/>
+        </w:trPr>
+        <w:tc>
+          <w:tcPr>
+            <w:tcW w:w="1760" w:type="dxa"/>
+            <w:tcBorders>
+              <w:top w:val="nil"/>
+              <w:left w:val="nil"/>
+              <w:bottom w:val="nil"/>
+              <w:right w:val="nil"/>
+            </w:tcBorders>
+            <w:shd w:val="clear" w:color="auto" w:fill="auto"/>
+            <w:noWrap/>
+            <w:vAlign w:val="bottom"/>
+            <w:hideMark/>
+          </w:tcPr>
+          <w:p>
+            <w:pPr>
+              <w:spacing w:after="0" w:line="240" w:lineRule="auto"/>
+              <w:rPr>
+                <w:rFonts w:ascii="Aptos Narrow" w:eastAsia="Times New Roman" w:hAnsi="Aptos Narrow" w:cs="Times New Roman"/>
+                <w:color w:val="000000"/>
+                <w:kern w:val="0"/>
+                <w14:ligatures w14:val="none"/>
+              </w:rPr>
+            </w:pPr>
+            <w:r>
+              <w:rPr>
+                <w:rFonts w:ascii="Aptos Narrow" w:eastAsia="Times New Roman" w:hAnsi="Aptos Narrow" w:cs="Times New Roman"/>
+                <w:color w:val="000000"/>
+                <w:kern w:val="0"/>
+                <w14:ligatures w14:val="none"/>
+              </w:rPr>
+              <w:t>Decision Tree</w:t>
+            </w:r>
+          </w:p>
+        </w:tc>
+        <w:tc>
+          <w:tcPr>
+            <w:tcW w:w="980" w:type="dxa"/>
+            <w:tcBorders>
+              <w:top w:val="nil"/>
+              <w:left w:val="nil"/>
+              <w:bottom w:val="nil"/>
+              <w:right w:val="nil"/>
+            </w:tcBorders>
+            <w:shd w:val="clear" w:color="auto" w:fill="auto"/>
+            <w:noWrap/>
+            <w:vAlign w:val="bottom"/>
+            <w:hideMark/>
+          </w:tcPr>
+          <w:p>
+            <w:pPr>
+              <w:spacing w:after="0" w:line="240" w:lineRule="auto"/>
+              <w:jc w:val="right"/>
+              <w:rPr>
+                <w:rFonts w:ascii="Aptos Narrow" w:eastAsia="Times New Roman" w:hAnsi="Aptos Narrow" w:cs="Times New Roman"/>
+                <w:color w:val="000000"/>
+                <w:kern w:val="0"/>
+                <w14:ligatures w14:val="none"/>
+              </w:rPr>
+            </w:pPr>
+            <w:r>
+              <w:rPr>
+                <w:rFonts w:ascii="Aptos Narrow" w:eastAsia="Times New Roman" w:hAnsi="Aptos Narrow" w:cs="Times New Roman"/>
+                <w:color w:val="000000"/>
+                <w:kern w:val="0"/>
+                <w14:ligatures w14:val="none"/>
+              </w:rPr>
+              <w:t>0</w:t>
+            </w:r>
+          </w:p>
+        </w:tc>
+        <w:tc>
+          <w:tcPr>
+            <w:tcW w:w="1080" w:type="dxa"/>
+            <w:tcBorders>
+              <w:top w:val="nil"/>
+              <w:left w:val="nil"/>
+              <w:bottom w:val="nil"/>
+              <w:right w:val="nil"/>
+            </w:tcBorders>
+            <w:shd w:val="clear" w:color="auto" w:fill="auto"/>
+            <w:noWrap/>
+            <w:vAlign w:val="bottom"/>
+            <w:hideMark/>
+          </w:tcPr>
+          <w:p>
+            <w:pPr>
+              <w:spacing w:after="0" w:line="240" w:lineRule="auto"/>
+              <w:jc w:val="right"/>
+              <w:rPr>
+                <w:rFonts w:ascii="Aptos Narrow" w:eastAsia="Times New Roman" w:hAnsi="Aptos Narrow" w:cs="Times New Roman"/>
+                <w:color w:val="000000"/>
+                <w:kern w:val="0"/>
+                <w14:ligatures w14:val="none"/>
+              </w:rPr>
+            </w:pPr>
+            <w:r>
+              <w:rPr>
+                <w:rFonts w:ascii="Aptos Narrow" w:eastAsia="Times New Roman" w:hAnsi="Aptos Narrow" w:cs="Times New Roman"/>
+                <w:color w:val="000000"/>
+                <w:kern w:val="0"/>
+                <w14:ligatures w14:val="none"/>
+              </w:rPr>
+              <w:t>0</w:t>
+            </w:r>
+          </w:p>
+        </w:tc>
+        <w:tc>
+          <w:tcPr>
+            <w:tcW w:w="880" w:type="dxa"/>
+            <w:tcBorders>
+              <w:top w:val="nil"/>
+              <w:left w:val="nil"/>
+              <w:bottom w:val="nil"/>
+              <w:right w:val="nil"/>
+            </w:tcBorders>
+            <w:shd w:val="clear" w:color="auto" w:fill="auto"/>
+            <w:noWrap/>
+            <w:vAlign w:val="bottom"/>
+            <w:hideMark/>
+          </w:tcPr>
+          <w:p>
+            <w:pPr>
+              <w:spacing w:after="0" w:line="240" w:lineRule="auto"/>
+              <w:jc w:val="right"/>
+              <w:rPr>
+                <w:rFonts w:ascii="Aptos Narrow" w:eastAsia="Times New Roman" w:hAnsi="Aptos Narrow" w:cs="Times New Roman"/>
+                <w:color w:val="000000"/>
+                <w:kern w:val="0"/>
+                <w14:ligatures w14:val="none"/>
+              </w:rPr>
+            </w:pPr>
+            <w:r>
+              <w:rPr>
+                <w:rFonts w:ascii="Aptos Narrow" w:eastAsia="Times New Roman" w:hAnsi="Aptos Narrow" w:cs="Times New Roman"/>
+                <w:color w:val="000000"/>
+                <w:kern w:val="0"/>
+                <w14:ligatures w14:val="none"/>
+              </w:rPr>
+              <w:t>1</w:t>
+            </w:r>
+          </w:p>
+        </w:tc>
+        <w:tc>
+          <w:tcPr>
+            <w:tcW w:w="960" w:type="dxa"/>
+            <w:tcBorders>
+              <w:top w:val="nil"/>
+              <w:left w:val="nil"/>
+              <w:bottom w:val="nil"/>
+              <w:right w:val="nil"/>
+            </w:tcBorders>
+            <w:shd w:val="clear" w:color="auto" w:fill="auto"/>
+            <w:noWrap/>
+            <w:vAlign w:val="bottom"/>
+            <w:hideMark/>
+          </w:tcPr>
+          <w:p>
+            <w:pPr>
+              <w:spacing w:after="0" w:line="240" w:lineRule="auto"/>
+              <w:jc w:val="right"/>
+              <w:rPr>
+                <w:rFonts w:ascii="Aptos Narrow" w:eastAsia="Times New Roman" w:hAnsi="Aptos Narrow" w:cs="Times New Roman"/>
+                <w:color w:val="000000"/>
+                <w:kern w:val="0"/>
+                <w14:ligatures w14:val="none"/>
+              </w:rPr>
+            </w:pPr>
+          </w:p>
+        </w:tc>
+      </w:tr>
+      <w:tr>
+        <w:trPr>
+          <w:trHeight w:val="300"/>
+        </w:trPr>
+        <w:tc>
+          <w:tcPr>
+            <w:tcW w:w="1760" w:type="dxa"/>
+            <w:tcBorders>
+              <w:top w:val="nil"/>
+              <w:left w:val="nil"/>
+              <w:bottom w:val="nil"/>
+              <w:right w:val="nil"/>
+            </w:tcBorders>
+            <w:shd w:val="clear" w:color="auto" w:fill="auto"/>
+            <w:noWrap/>
+            <w:vAlign w:val="bottom"/>
+            <w:hideMark/>
+          </w:tcPr>
+          <w:p>
+            <w:pPr>
+              <w:spacing w:after="0" w:line="240" w:lineRule="auto"/>
+              <w:rPr>
+                <w:rFonts w:ascii="Aptos Narrow" w:eastAsia="Times New Roman" w:hAnsi="Aptos Narrow" w:cs="Times New Roman"/>
+                <w:color w:val="000000"/>
+                <w:kern w:val="0"/>
+                <w14:ligatures w14:val="none"/>
+              </w:rPr>
+            </w:pPr>
+            <w:r>
+              <w:rPr>
+                <w:rFonts w:ascii="Aptos Narrow" w:eastAsia="Times New Roman" w:hAnsi="Aptos Narrow" w:cs="Times New Roman"/>
+                <w:color w:val="000000"/>
+                <w:kern w:val="0"/>
+                <w14:ligatures w14:val="none"/>
+              </w:rPr>
+              <w:t>Random Forest</w:t>
+            </w:r>
+          </w:p>
+        </w:tc>
+        <w:tc>
+          <w:tcPr>
+            <w:tcW w:w="980" w:type="dxa"/>
+            <w:tcBorders>
+              <w:top w:val="nil"/>
+              <w:left w:val="nil"/>
+              <w:bottom w:val="nil"/>
+              <w:right w:val="nil"/>
+            </w:tcBorders>
+            <w:shd w:val="clear" w:color="auto" w:fill="auto"/>
+            <w:noWrap/>
+            <w:vAlign w:val="bottom"/>
+            <w:hideMark/>
+          </w:tcPr>
+          <w:p>
+            <w:pPr>
+              <w:spacing w:after="0" w:line="240" w:lineRule="auto"/>
+              <w:jc w:val="right"/>
+              <w:rPr>
+                <w:rFonts w:ascii="Aptos Narrow" w:eastAsia="Times New Roman" w:hAnsi="Aptos Narrow" w:cs="Times New Roman"/>
+                <w:color w:val="000000"/>
+                <w:kern w:val="0"/>
+                <w14:ligatures w14:val="none"/>
+              </w:rPr>
+            </w:pPr>
+            <w:r>
+              <w:rPr>
+                <w:rFonts w:ascii="Aptos Narrow" w:eastAsia="Times New Roman" w:hAnsi="Aptos Narrow" w:cs="Times New Roman"/>
+                <w:color w:val="000000"/>
+                <w:kern w:val="0"/>
+                <w14:ligatures w14:val="none"/>
+              </w:rPr>
+              <w:t>0</w:t>
+            </w:r>
+          </w:p>
+        </w:tc>
+        <w:tc>
+          <w:tcPr>
+            <w:tcW w:w="1080" w:type="dxa"/>
+            <w:tcBorders>
+              <w:top w:val="nil"/>
+              <w:left w:val="nil"/>
+              <w:bottom w:val="nil"/>
+              <w:right w:val="nil"/>
+            </w:tcBorders>
+            <w:shd w:val="clear" w:color="auto" w:fill="auto"/>
+            <w:noWrap/>
+            <w:vAlign w:val="bottom"/>
+            <w:hideMark/>
+          </w:tcPr>
+          <w:p>
+            <w:pPr>
+              <w:spacing w:after="0" w:line="240" w:lineRule="auto"/>
+              <w:jc w:val="right"/>
+              <w:rPr>
+                <w:rFonts w:ascii="Aptos Narrow" w:eastAsia="Times New Roman" w:hAnsi="Aptos Narrow" w:cs="Times New Roman"/>
+                <w:color w:val="000000"/>
+                <w:kern w:val="0"/>
+                <w14:ligatures w14:val="none"/>
+              </w:rPr>
+            </w:pPr>
+            <w:r>
+              <w:rPr>
+                <w:rFonts w:ascii="Aptos Narrow" w:eastAsia="Times New Roman" w:hAnsi="Aptos Narrow" w:cs="Times New Roman"/>
+                <w:color w:val="000000"/>
+                <w:kern w:val="0"/>
+                <w14:ligatures w14:val="none"/>
+              </w:rPr>
+              <w:t>0</w:t>
+            </w:r>
+          </w:p>
+        </w:tc>
+        <w:tc>
+          <w:tcPr>
+            <w:tcW w:w="880" w:type="dxa"/>
+            <w:tcBorders>
+              <w:top w:val="nil"/>
+              <w:left w:val="nil"/>
+              <w:bottom w:val="nil"/>
+              <w:right w:val="nil"/>
+            </w:tcBorders>
+            <w:shd w:val="clear" w:color="auto" w:fill="auto"/>
+            <w:noWrap/>
+            <w:vAlign w:val="bottom"/>
+            <w:hideMark/>
+          </w:tcPr>
+          <w:p>
+            <w:pPr>
+              <w:spacing w:after="0" w:line="240" w:lineRule="auto"/>
+              <w:jc w:val="right"/>
+              <w:rPr>
+                <w:rFonts w:ascii="Aptos Narrow" w:eastAsia="Times New Roman" w:hAnsi="Aptos Narrow" w:cs="Times New Roman"/>
+                <w:color w:val="000000"/>
+                <w:kern w:val="0"/>
+                <w14:ligatures w14:val="none"/>
+              </w:rPr>
+            </w:pPr>
+            <w:r>
+              <w:rPr>
+                <w:rFonts w:ascii="Aptos Narrow" w:eastAsia="Times New Roman" w:hAnsi="Aptos Narrow" w:cs="Times New Roman"/>
+                <w:color w:val="000000"/>
+                <w:kern w:val="0"/>
+                <w14:ligatures w14:val="none"/>
+              </w:rPr>
+              <w:t>1</w:t>
+            </w:r>
+          </w:p>
+        </w:tc>
+        <w:tc>
+          <w:tcPr>
+            <w:tcW w:w="960" w:type="dxa"/>
+            <w:tcBorders>
+              <w:top w:val="nil"/>
+              <w:left w:val="nil"/>
+              <w:bottom w:val="nil"/>
+              <w:right w:val="nil"/>
+            </w:tcBorders>
+            <w:shd w:val="clear" w:color="auto" w:fill="auto"/>
+            <w:noWrap/>
+            <w:vAlign w:val="bottom"/>
+            <w:hideMark/>
+          </w:tcPr>
+          <w:p>
+            <w:pPr>
+              <w:spacing w:after="0" w:line="240" w:lineRule="auto"/>
+              <w:jc w:val="right"/>
+              <w:rPr>
+                <w:rFonts w:ascii="Aptos Narrow" w:eastAsia="Times New Roman" w:hAnsi="Aptos Narrow" w:cs="Times New Roman"/>
+                <w:color w:val="000000"/>
+                <w:kern w:val="0"/>
+                <w14:ligatures w14:val="none"/>
+              </w:rPr>
+            </w:pPr>
+          </w:p>
+        </w:tc>
+      </w:tr>
+      <w:tr>
+        <w:trPr>
+          <w:trHeight w:val="300"/>
+        </w:trPr>
+        <w:tc>
+          <w:tcPr>
+            <w:tcW w:w="1760" w:type="dxa"/>
+            <w:tcBorders>
+              <w:top w:val="nil"/>
+              <w:left w:val="nil"/>
+              <w:bottom w:val="nil"/>
+              <w:right w:val="nil"/>
+            </w:tcBorders>
+            <w:shd w:val="clear" w:color="auto" w:fill="auto"/>
+            <w:noWrap/>
+            <w:vAlign w:val="bottom"/>
+            <w:hideMark/>
+          </w:tcPr>
+          <w:p>
+            <w:pPr>
+              <w:spacing w:after="0" w:line="240" w:lineRule="auto"/>
+              <w:rPr>
+                <w:rFonts w:ascii="Aptos Narrow" w:eastAsia="Times New Roman" w:hAnsi="Aptos Narrow" w:cs="Times New Roman"/>
+                <w:color w:val="000000"/>
+                <w:kern w:val="0"/>
+                <w14:ligatures w14:val="none"/>
+              </w:rPr>
+            </w:pPr>
+            <w:proofErr w:type="spellStart"/>
+            <w:r>
+              <w:rPr>
+                <w:rFonts w:ascii="Aptos Narrow" w:eastAsia="Times New Roman" w:hAnsi="Aptos Narrow" w:cs="Times New Roman"/>
+                <w:color w:val="000000"/>
+                <w:kern w:val="0"/>
+                <w14:ligatures w14:val="none"/>
+              </w:rPr>
+              <w:t>XGBoost</w:t>
+            </w:r>
+            <w:proofErr w:type="spellEnd"/>
+          </w:p>
+        </w:tc>
+        <w:tc>
+          <w:tcPr>
+            <w:tcW w:w="980" w:type="dxa"/>
+            <w:tcBorders>
+              <w:top w:val="nil"/>
+              <w:left w:val="nil"/>
+              <w:bottom w:val="nil"/>
+              <w:right w:val="nil"/>
+            </w:tcBorders>
+            <w:shd w:val="clear" w:color="auto" w:fill="auto"/>
+            <w:noWrap/>
+            <w:vAlign w:val="bottom"/>
+            <w:hideMark/>
+          </w:tcPr>
+          <w:p>
+            <w:pPr>
+              <w:spacing w:after="0" w:line="240" w:lineRule="auto"/>
+              <w:jc w:val="right"/>
+              <w:rPr>
+                <w:rFonts w:ascii="Aptos Narrow" w:eastAsia="Times New Roman" w:hAnsi="Aptos Narrow" w:cs="Times New Roman"/>
+                <w:color w:val="000000"/>
+                <w:kern w:val="0"/>
+                <w14:ligatures w14:val="none"/>
+              </w:rPr>
+            </w:pPr>
+            <w:r>
+              <w:rPr>
+                <w:rFonts w:ascii="Aptos Narrow" w:eastAsia="Times New Roman" w:hAnsi="Aptos Narrow" w:cs="Times New Roman"/>
+                <w:color w:val="000000"/>
+                <w:kern w:val="0"/>
+                <w14:ligatures w14:val="none"/>
+              </w:rPr>
+              <w:t>0.0004</w:t>
+            </w:r>
+          </w:p>
+        </w:tc>
+        <w:tc>
+          <w:tcPr>
+            <w:tcW w:w="1080" w:type="dxa"/>
+            <w:tcBorders>
+              <w:top w:val="nil"/>
+              <w:left w:val="nil"/>
+              <w:bottom w:val="nil"/>
+              <w:right w:val="nil"/>
+            </w:tcBorders>
+            <w:shd w:val="clear" w:color="auto" w:fill="auto"/>
+            <w:noWrap/>
+            <w:vAlign w:val="bottom"/>
+            <w:hideMark/>
+          </w:tcPr>
+          <w:p>
+            <w:pPr>
+              <w:spacing w:after="0" w:line="240" w:lineRule="auto"/>
+              <w:jc w:val="right"/>
+              <w:rPr>
+                <w:rFonts w:ascii="Aptos Narrow" w:eastAsia="Times New Roman" w:hAnsi="Aptos Narrow" w:cs="Times New Roman"/>
+                <w:color w:val="000000"/>
+                <w:kern w:val="0"/>
+                <w14:ligatures w14:val="none"/>
+              </w:rPr>
+            </w:pPr>
+            <w:r>
+              <w:rPr>
+                <w:rFonts w:ascii="Aptos Narrow" w:eastAsia="Times New Roman" w:hAnsi="Aptos Narrow" w:cs="Times New Roman"/>
+                <w:color w:val="000000"/>
+                <w:kern w:val="0"/>
+                <w14:ligatures w14:val="none"/>
+              </w:rPr>
+              <w:t>0.0004</w:t>
+            </w:r>
+          </w:p>
+        </w:tc>
+        <w:tc>
+          <w:tcPr>
+            <w:tcW w:w="880" w:type="dxa"/>
+            <w:tcBorders>
+              <w:top w:val="nil"/>
+              <w:left w:val="nil"/>
+              <w:bottom w:val="nil"/>
+              <w:right w:val="nil"/>
+            </w:tcBorders>
+            <w:shd w:val="clear" w:color="auto" w:fill="auto"/>
+            <w:noWrap/>
+            <w:vAlign w:val="bottom"/>
+            <w:hideMark/>
+          </w:tcPr>
+          <w:p>
+            <w:pPr>
+              <w:spacing w:after="0" w:line="240" w:lineRule="auto"/>
+              <w:jc w:val="right"/>
+              <w:rPr>
+                <w:rFonts w:ascii="Aptos Narrow" w:eastAsia="Times New Roman" w:hAnsi="Aptos Narrow" w:cs="Times New Roman"/>
+                <w:color w:val="000000"/>
+                <w:kern w:val="0"/>
+                <w14:ligatures w14:val="none"/>
+              </w:rPr>
+            </w:pPr>
+            <w:r>
+              <w:rPr>
+                <w:rFonts w:ascii="Aptos Narrow" w:eastAsia="Times New Roman" w:hAnsi="Aptos Narrow" w:cs="Times New Roman"/>
+                <w:color w:val="000000"/>
+                <w:kern w:val="0"/>
+                <w14:ligatures w14:val="none"/>
+              </w:rPr>
+              <w:t>1</w:t>
+            </w:r>
+          </w:p>
+        </w:tc>
+        <w:tc>
+          <w:tcPr>
+            <w:tcW w:w="960" w:type="dxa"/>
+            <w:tcBorders>
+              <w:top w:val="nil"/>
+              <w:left w:val="nil"/>
+              <w:bottom w:val="nil"/>
+              <w:right w:val="nil"/>
+            </w:tcBorders>
+            <w:shd w:val="clear" w:color="auto" w:fill="auto"/>
+            <w:noWrap/>
+            <w:vAlign w:val="bottom"/>
+            <w:hideMark/>
+          </w:tcPr>
+          <w:p>
+            <w:pPr>
+              <w:spacing w:after="0" w:line="240" w:lineRule="auto"/>
+              <w:jc w:val="right"/>
+              <w:rPr>
+                <w:rFonts w:ascii="Aptos Narrow" w:eastAsia="Times New Roman" w:hAnsi="Aptos Narrow" w:cs="Times New Roman"/>
+                <w:color w:val="000000"/>
+                <w:kern w:val="0"/>
+                <w14:ligatures w14:val="none"/>
+              </w:rPr>
+            </w:pPr>
+          </w:p>
+        </w:tc>
+      </w:tr>
+      <w:tr>
+        <w:trPr>
+          <w:trHeight w:val="300"/>
+        </w:trPr>
+        <w:tc>
+          <w:tcPr>
+            <w:tcW w:w="1760" w:type="dxa"/>
+            <w:tcBorders>
+              <w:top w:val="nil"/>
+              <w:left w:val="nil"/>
+              <w:bottom w:val="nil"/>
+              <w:right w:val="nil"/>
+            </w:tcBorders>
+            <w:shd w:val="clear" w:color="auto" w:fill="auto"/>
+            <w:noWrap/>
+            <w:vAlign w:val="bottom"/>
+            <w:hideMark/>
+          </w:tcPr>
+          <w:p>
+            <w:pPr>
+              <w:spacing w:after="0" w:line="240" w:lineRule="auto"/>
+              <w:rPr>
+                <w:rFonts w:ascii="Times New Roman" w:eastAsia="Times New Roman" w:hAnsi="Times New Roman" w:cs="Times New Roman"/>
+                <w:kern w:val="0"/>
+                <w:sz w:val="20"/>
+                <w:szCs w:val="20"/>
+                <w14:ligatures w14:val="none"/>
+              </w:rPr>
+            </w:pPr>
+          </w:p>
+        </w:tc>
+        <w:tc>
+          <w:tcPr>
+            <w:tcW w:w="980" w:type="dxa"/>
+            <w:tcBorders>
+              <w:top w:val="nil"/>
+              <w:left w:val="nil"/>
+              <w:bottom w:val="nil"/>
+              <w:right w:val="nil"/>
+            </w:tcBorders>
+            <w:shd w:val="clear" w:color="auto" w:fill="auto"/>
+            <w:noWrap/>
+            <w:vAlign w:val="bottom"/>
+            <w:hideMark/>
+          </w:tcPr>
+          <w:p>
+            <w:pPr>
+              <w:spacing w:after="0" w:line="240" w:lineRule="auto"/>
+              <w:rPr>
+                <w:rFonts w:ascii="Times New Roman" w:eastAsia="Times New Roman" w:hAnsi="Times New Roman" w:cs="Times New Roman"/>
+                <w:kern w:val="0"/>
+                <w:sz w:val="20"/>
+                <w:szCs w:val="20"/>
+                <w14:ligatures w14:val="none"/>
+              </w:rPr>
+            </w:pPr>
+          </w:p>
+        </w:tc>
+        <w:tc>
+          <w:tcPr>
+            <w:tcW w:w="1080" w:type="dxa"/>
+            <w:tcBorders>
+              <w:top w:val="nil"/>
+              <w:left w:val="nil"/>
+              <w:bottom w:val="nil"/>
+              <w:right w:val="nil"/>
+            </w:tcBorders>
+            <w:shd w:val="clear" w:color="auto" w:fill="auto"/>
+            <w:noWrap/>
+            <w:vAlign w:val="bottom"/>
+            <w:hideMark/>
+          </w:tcPr>
+          <w:p>
+            <w:pPr>
+              <w:spacing w:after="0" w:line="240" w:lineRule="auto"/>
+              <w:rPr>
+                <w:rFonts w:ascii="Times New Roman" w:eastAsia="Times New Roman" w:hAnsi="Times New Roman" w:cs="Times New Roman"/>
+                <w:kern w:val="0"/>
+                <w:sz w:val="20"/>
+                <w:szCs w:val="20"/>
+                <w14:ligatures w14:val="none"/>
+              </w:rPr>
+            </w:pPr>
+          </w:p>
+        </w:tc>
+        <w:tc>
+          <w:tcPr>
+            <w:tcW w:w="880" w:type="dxa"/>
+            <w:tcBorders>
+              <w:top w:val="nil"/>
+              <w:left w:val="nil"/>
+              <w:bottom w:val="nil"/>
+              <w:right w:val="nil"/>
+            </w:tcBorders>
+            <w:shd w:val="clear" w:color="auto" w:fill="auto"/>
+            <w:noWrap/>
+            <w:vAlign w:val="bottom"/>
+            <w:hideMark/>
+          </w:tcPr>
+          <w:p>
+            <w:pPr>
+              <w:spacing w:after="0" w:line="240" w:lineRule="auto"/>
+              <w:rPr>
+                <w:rFonts w:ascii="Times New Roman" w:eastAsia="Times New Roman" w:hAnsi="Times New Roman" w:cs="Times New Roman"/>
+                <w:kern w:val="0"/>
+                <w:sz w:val="20"/>
+                <w:szCs w:val="20"/>
+                <w14:ligatures w14:val="none"/>
+              </w:rPr>
+            </w:pPr>
+          </w:p>
+        </w:tc>
+        <w:tc>
+          <w:tcPr>
+            <w:tcW w:w="960" w:type="dxa"/>
+            <w:tcBorders>
+              <w:top w:val="nil"/>
+              <w:left w:val="nil"/>
+              <w:bottom w:val="nil"/>
+              <w:right w:val="nil"/>
+            </w:tcBorders>
+            <w:shd w:val="clear" w:color="auto" w:fill="auto"/>
+            <w:noWrap/>
+            <w:vAlign w:val="bottom"/>
+            <w:hideMark/>
+          </w:tcPr>
+          <w:p>
+            <w:pPr>
+              <w:spacing w:after="0" w:line="240" w:lineRule="auto"/>
+              <w:rPr>
+                <w:rFonts w:ascii="Times New Roman" w:eastAsia="Times New Roman" w:hAnsi="Times New Roman" w:cs="Times New Roman"/>
+                <w:kern w:val="0"/>
+                <w:sz w:val="20"/>
+                <w:szCs w:val="20"/>
+                <w14:ligatures w14:val="none"/>
+              </w:rPr>
+            </w:pPr>
+          </w:p>
+        </w:tc>
+      </w:tr>
+    </w:tbl>
+    <w:p>
+      <w:pPr>
         <w:rPr>
           <w:rFonts w:ascii="Segoe UI Emoji" w:hAnsi="Segoe UI Emoji" w:cs="Segoe UI Emoji"/>
           <w:b/>
           <w:bCs/>
         </w:rPr>
+      </w:pPr>
+    </w:p>
+    <w:p>
+      <w:pPr>
+        <w:rPr>
+          <w:rFonts w:ascii="Segoe UI Emoji" w:hAnsi="Segoe UI Emoji" w:cs="Segoe UI Emoji"/>
+          <w:b/>
+          <w:bCs/>
+        </w:rPr>
+      </w:pPr>
+    </w:p>
+    <w:p>
+      <w:pPr>
+        <w:rPr>
+          <w:b/>
+          <w:bCs/>
+        </w:rPr>
+      </w:pPr>
+      <w:r>
+        <w:rPr>
+          <w:rFonts w:ascii="Segoe UI Emoji" w:hAnsi="Segoe UI Emoji" w:cs="Segoe UI Emoji"/>
+          <w:b/>
+          <w:bCs/>
+        </w:rPr>
         <w:t>🔷</w:t>
       </w:r>
       <w:r>
@@ -682,8 +2076,9 @@
     </w:p>
     <w:p>
       <w:r>
+        <w:lastRenderedPageBreak/>
         <w:pict w14:anchorId="3E541ABF">
-          <v:rect id="_x0000_i1273" style="width:0;height:1.5pt" o:hralign="center" o:hrstd="t" o:hr="t" fillcolor="#a0a0a0" stroked="f"/>
+          <v:rect id="_x0000_i1038" style="width:0;height:1.5pt" o:hralign="center" o:hrstd="t" o:hr="t" fillcolor="#a0a0a0" stroked="f"/>
         </w:pict>
       </w:r>
     </w:p>
@@ -822,7 +2217,7 @@
     <w:p>
       <w:r>
         <w:pict w14:anchorId="0C8536B2">
-          <v:rect id="_x0000_i1275" style="width:0;height:1.5pt" o:hralign="center" o:hrstd="t" o:hr="t" fillcolor="#a0a0a0" stroked="f"/>
+          <v:rect id="_x0000_i1039" style="width:0;height:1.5pt" o:hralign="center" o:hrstd="t" o:hr="t" fillcolor="#a0a0a0" stroked="f"/>
         </w:pict>
       </w:r>
     </w:p>
@@ -857,7 +2252,7 @@
     <w:p>
       <w:r>
         <w:pict w14:anchorId="4A5462E2">
-          <v:rect id="_x0000_i1277" style="width:0;height:1.5pt" o:hralign="center" o:hrstd="t" o:hr="t" fillcolor="#a0a0a0" stroked="f"/>
+          <v:rect id="_x0000_i1040" style="width:0;height:1.5pt" o:hralign="center" o:hrstd="t" o:hr="t" fillcolor="#a0a0a0" stroked="f"/>
         </w:pict>
       </w:r>
     </w:p>
@@ -892,7 +2287,7 @@
     <w:p>
       <w:r>
         <w:pict w14:anchorId="2262656D">
-          <v:rect id="_x0000_i1278" style="width:0;height:1.5pt" o:hralign="center" o:hrstd="t" o:hr="t" fillcolor="#a0a0a0" stroked="f"/>
+          <v:rect id="_x0000_i1041" style="width:0;height:1.5pt" o:hralign="center" o:hrstd="t" o:hr="t" fillcolor="#a0a0a0" stroked="f"/>
         </w:pict>
       </w:r>
     </w:p>
@@ -922,7 +2317,7 @@
     <w:p>
       <w:r>
         <w:pict w14:anchorId="33D9BA99">
-          <v:rect id="_x0000_i1279" style="width:0;height:1.5pt" o:hralign="center" o:hrstd="t" o:hr="t" fillcolor="#a0a0a0" stroked="f"/>
+          <v:rect id="_x0000_i1042" style="width:0;height:1.5pt" o:hralign="center" o:hrstd="t" o:hr="t" fillcolor="#a0a0a0" stroked="f"/>
         </w:pict>
       </w:r>
     </w:p>
@@ -973,7 +2368,6 @@
         </w:numPr>
       </w:pPr>
       <w:r>
-        <w:lastRenderedPageBreak/>
         <w:t>They are indirectly represented in stronger features</w:t>
       </w:r>
     </w:p>
@@ -991,7 +2385,7 @@
     <w:p>
       <w:r>
         <w:pict w14:anchorId="42D85BAB">
-          <v:rect id="_x0000_i1280" style="width:0;height:1.5pt" o:hralign="center" o:hrstd="t" o:hr="t" fillcolor="#a0a0a0" stroked="f"/>
+          <v:rect id="_x0000_i1043" style="width:0;height:1.5pt" o:hralign="center" o:hrstd="t" o:hr="t" fillcolor="#a0a0a0" stroked="f"/>
         </w:pict>
       </w:r>
     </w:p>
@@ -1020,13 +2414,14 @@
     </w:p>
     <w:p>
       <w:r>
+        <w:lastRenderedPageBreak/>
         <w:t>“Feature redundancy leads to dominance of a small subset of variables.”</w:t>
       </w:r>
     </w:p>
     <w:p>
       <w:r>
         <w:pict w14:anchorId="01419208">
-          <v:rect id="_x0000_i1281" style="width:0;height:1.5pt" o:hralign="center" o:hrstd="t" o:hr="t" fillcolor="#a0a0a0" stroked="f"/>
+          <v:rect id="_x0000_i1044" style="width:0;height:1.5pt" o:hralign="center" o:hrstd="t" o:hr="t" fillcolor="#a0a0a0" stroked="f"/>
         </w:pict>
       </w:r>
     </w:p>
@@ -1061,7 +2456,7 @@
     <w:p>
       <w:r>
         <w:pict w14:anchorId="526DB165">
-          <v:rect id="_x0000_i1285" style="width:0;height:1.5pt" o:hralign="center" o:hrstd="t" o:hr="t" fillcolor="#a0a0a0" stroked="f"/>
+          <v:rect id="_x0000_i1045" style="width:0;height:1.5pt" o:hralign="center" o:hrstd="t" o:hr="t" fillcolor="#a0a0a0" stroked="f"/>
         </w:pict>
       </w:r>
     </w:p>
@@ -1091,7 +2486,7 @@
     <w:p>
       <w:r>
         <w:pict w14:anchorId="553B51B2">
-          <v:rect id="_x0000_i1286" style="width:0;height:1.5pt" o:hralign="center" o:hrstd="t" o:hr="t" fillcolor="#a0a0a0" stroked="f"/>
+          <v:rect id="_x0000_i1046" style="width:0;height:1.5pt" o:hralign="center" o:hrstd="t" o:hr="t" fillcolor="#a0a0a0" stroked="f"/>
         </w:pict>
       </w:r>
     </w:p>
@@ -1159,7 +2554,7 @@
     <w:p>
       <w:r>
         <w:pict w14:anchorId="5FBA09FB">
-          <v:rect id="_x0000_i1287" style="width:0;height:1.5pt" o:hralign="center" o:hrstd="t" o:hr="t" fillcolor="#a0a0a0" stroked="f"/>
+          <v:rect id="_x0000_i1047" style="width:0;height:1.5pt" o:hralign="center" o:hrstd="t" o:hr="t" fillcolor="#a0a0a0" stroked="f"/>
         </w:pict>
       </w:r>
     </w:p>
@@ -1194,7 +2589,7 @@
     <w:p>
       <w:r>
         <w:pict w14:anchorId="7F1DC6BC">
-          <v:rect id="_x0000_i1288" style="width:0;height:1.5pt" o:hralign="center" o:hrstd="t" o:hr="t" fillcolor="#a0a0a0" stroked="f"/>
+          <v:rect id="_x0000_i1048" style="width:0;height:1.5pt" o:hralign="center" o:hrstd="t" o:hr="t" fillcolor="#a0a0a0" stroked="f"/>
         </w:pict>
       </w:r>
     </w:p>
@@ -1246,7 +2641,6 @@
     </w:p>
     <w:p>
       <w:r>
-        <w:lastRenderedPageBreak/>
         <w:t>3. Correlation Analysis</w:t>
       </w:r>
     </w:p>
@@ -3366,6 +4760,7 @@
   <w:style w:type="character" w:default="1" w:styleId="DefaultParagraphFont">
     <w:name w:val="Default Paragraph Font"/>
     <w:uiPriority w:val="1"/>
+    <w:semiHidden/>
     <w:unhideWhenUsed/>
   </w:style>
   <w:style w:type="table" w:default="1" w:styleId="TableNormal">

</xml_diff>